<commit_message>
latest results based on simulated data uploaded
</commit_message>
<xml_diff>
--- a/i_test/test_D6_Table_2/g_output/D6_Table_2_caratterizzazione_coorte_sottopopolazione_CAP_DPP4i.docx
+++ b/i_test/test_D6_Table_2/g_output/D6_Table_2_caratterizzazione_coorte_sottopopolazione_CAP_DPP4i.docx
@@ -231,7 +231,77 @@
               <w:pStyle w:val="Normal"/>
             </w:pPr>
             <w:r>
-              <w:t>589</w:t>
+              <w:t>559</w:t>
+            </w:r>
+          </w:p>
+        </w:tc>
+        <w:tc>
+          <w:p>
+            <w:pPr>
+              <w:pStyle w:val="Normal"/>
+            </w:pPr>
+            <w:r>
+              <w:t>582</w:t>
+            </w:r>
+          </w:p>
+        </w:tc>
+        <w:tc>
+          <w:p>
+            <w:pPr>
+              <w:pStyle w:val="Normal"/>
+            </w:pPr>
+            <w:r>
+              <w:t>522</w:t>
+            </w:r>
+          </w:p>
+        </w:tc>
+        <w:tc>
+          <w:p>
+            <w:pPr>
+              <w:pStyle w:val="Normal"/>
+            </w:pPr>
+            <w:r>
+              <w:t>531</w:t>
+            </w:r>
+          </w:p>
+        </w:tc>
+        <w:tc>
+          <w:p>
+            <w:pPr>
+              <w:pStyle w:val="Normal"/>
+            </w:pPr>
+            <w:r>
+              <w:t>549</w:t>
+            </w:r>
+          </w:p>
+        </w:tc>
+        <w:tc>
+          <w:p>
+            <w:pPr>
+              <w:pStyle w:val="Normal"/>
+            </w:pPr>
+            <w:r>
+              <w:t>519</w:t>
+            </w:r>
+          </w:p>
+        </w:tc>
+        <w:tc>
+          <w:p>
+            <w:pPr>
+              <w:pStyle w:val="Normal"/>
+            </w:pPr>
+            <w:r>
+              <w:t>606</w:t>
+            </w:r>
+          </w:p>
+        </w:tc>
+        <w:tc>
+          <w:p>
+            <w:pPr>
+              <w:pStyle w:val="Normal"/>
+            </w:pPr>
+            <w:r>
+              <w:t>588</w:t>
             </w:r>
           </w:p>
         </w:tc>
@@ -242,76 +312,6 @@
             </w:pPr>
             <w:r>
               <w:t>544</w:t>
-            </w:r>
-          </w:p>
-        </w:tc>
-        <w:tc>
-          <w:p>
-            <w:pPr>
-              <w:pStyle w:val="Normal"/>
-            </w:pPr>
-            <w:r>
-              <w:t>559</w:t>
-            </w:r>
-          </w:p>
-        </w:tc>
-        <w:tc>
-          <w:p>
-            <w:pPr>
-              <w:pStyle w:val="Normal"/>
-            </w:pPr>
-            <w:r>
-              <w:t>528</w:t>
-            </w:r>
-          </w:p>
-        </w:tc>
-        <w:tc>
-          <w:p>
-            <w:pPr>
-              <w:pStyle w:val="Normal"/>
-            </w:pPr>
-            <w:r>
-              <w:t>556</w:t>
-            </w:r>
-          </w:p>
-        </w:tc>
-        <w:tc>
-          <w:p>
-            <w:pPr>
-              <w:pStyle w:val="Normal"/>
-            </w:pPr>
-            <w:r>
-              <w:t>555</w:t>
-            </w:r>
-          </w:p>
-        </w:tc>
-        <w:tc>
-          <w:p>
-            <w:pPr>
-              <w:pStyle w:val="Normal"/>
-            </w:pPr>
-            <w:r>
-              <w:t>579</w:t>
-            </w:r>
-          </w:p>
-        </w:tc>
-        <w:tc>
-          <w:p>
-            <w:pPr>
-              <w:pStyle w:val="Normal"/>
-            </w:pPr>
-            <w:r>
-              <w:t>590</w:t>
-            </w:r>
-          </w:p>
-        </w:tc>
-        <w:tc>
-          <w:p>
-            <w:pPr>
-              <w:pStyle w:val="Normal"/>
-            </w:pPr>
-            <w:r>
-              <w:t>500</w:t>
             </w:r>
           </w:p>
         </w:tc>
@@ -323,97 +323,97 @@
               <w:pStyle w:val="Normal"/>
             </w:pPr>
             <w:r>
-              <w:t>BMI pregravidico basso (&lt;18,5), n (%)</w:t>
-            </w:r>
-          </w:p>
-        </w:tc>
-        <w:tc>
-          <w:p>
-            <w:pPr>
-              <w:pStyle w:val="Normal"/>
-            </w:pPr>
-            <w:r>
-              <w:t>175 (29,7%)</w:t>
-            </w:r>
-          </w:p>
-        </w:tc>
-        <w:tc>
-          <w:p>
-            <w:pPr>
-              <w:pStyle w:val="Normal"/>
-            </w:pPr>
-            <w:r>
-              <w:t>145 (26,7%)</w:t>
-            </w:r>
-          </w:p>
-        </w:tc>
-        <w:tc>
-          <w:p>
-            <w:pPr>
-              <w:pStyle w:val="Normal"/>
-            </w:pPr>
-            <w:r>
-              <w:t>151 (27,0%)</w:t>
-            </w:r>
-          </w:p>
-        </w:tc>
-        <w:tc>
-          <w:p>
-            <w:pPr>
-              <w:pStyle w:val="Normal"/>
-            </w:pPr>
-            <w:r>
-              <w:t>140 (26,5%)</w:t>
-            </w:r>
-          </w:p>
-        </w:tc>
-        <w:tc>
-          <w:p>
-            <w:pPr>
-              <w:pStyle w:val="Normal"/>
-            </w:pPr>
-            <w:r>
-              <w:t>144 (25,9%)</w:t>
-            </w:r>
-          </w:p>
-        </w:tc>
-        <w:tc>
-          <w:p>
-            <w:pPr>
-              <w:pStyle w:val="Normal"/>
-            </w:pPr>
-            <w:r>
-              <w:t>141 (25,4%)</w:t>
-            </w:r>
-          </w:p>
-        </w:tc>
-        <w:tc>
-          <w:p>
-            <w:pPr>
-              <w:pStyle w:val="Normal"/>
-            </w:pPr>
-            <w:r>
-              <w:t>160 (27,6%)</w:t>
-            </w:r>
-          </w:p>
-        </w:tc>
-        <w:tc>
-          <w:p>
-            <w:pPr>
-              <w:pStyle w:val="Normal"/>
-            </w:pPr>
-            <w:r>
-              <w:t>166 (28,1%)</w:t>
-            </w:r>
-          </w:p>
-        </w:tc>
-        <w:tc>
-          <w:p>
-            <w:pPr>
-              <w:pStyle w:val="Normal"/>
-            </w:pPr>
-            <w:r>
-              <w:t>155 (31,0%)</w:t>
+              <w:t>Età alla data indice,</w:t>
+            </w:r>
+          </w:p>
+        </w:tc>
+        <w:tc>
+          <w:p>
+            <w:pPr>
+              <w:pStyle w:val="Normal"/>
+            </w:pPr>
+            <w:r>
+              <w:t/>
+            </w:r>
+          </w:p>
+        </w:tc>
+        <w:tc>
+          <w:p>
+            <w:pPr>
+              <w:pStyle w:val="Normal"/>
+            </w:pPr>
+            <w:r>
+              <w:t/>
+            </w:r>
+          </w:p>
+        </w:tc>
+        <w:tc>
+          <w:p>
+            <w:pPr>
+              <w:pStyle w:val="Normal"/>
+            </w:pPr>
+            <w:r>
+              <w:t/>
+            </w:r>
+          </w:p>
+        </w:tc>
+        <w:tc>
+          <w:p>
+            <w:pPr>
+              <w:pStyle w:val="Normal"/>
+            </w:pPr>
+            <w:r>
+              <w:t/>
+            </w:r>
+          </w:p>
+        </w:tc>
+        <w:tc>
+          <w:p>
+            <w:pPr>
+              <w:pStyle w:val="Normal"/>
+            </w:pPr>
+            <w:r>
+              <w:t/>
+            </w:r>
+          </w:p>
+        </w:tc>
+        <w:tc>
+          <w:p>
+            <w:pPr>
+              <w:pStyle w:val="Normal"/>
+            </w:pPr>
+            <w:r>
+              <w:t/>
+            </w:r>
+          </w:p>
+        </w:tc>
+        <w:tc>
+          <w:p>
+            <w:pPr>
+              <w:pStyle w:val="Normal"/>
+            </w:pPr>
+            <w:r>
+              <w:t/>
+            </w:r>
+          </w:p>
+        </w:tc>
+        <w:tc>
+          <w:p>
+            <w:pPr>
+              <w:pStyle w:val="Normal"/>
+            </w:pPr>
+            <w:r>
+              <w:t/>
+            </w:r>
+          </w:p>
+        </w:tc>
+        <w:tc>
+          <w:p>
+            <w:pPr>
+              <w:pStyle w:val="Normal"/>
+            </w:pPr>
+            <w:r>
+              <w:t/>
             </w:r>
           </w:p>
         </w:tc>
@@ -425,97 +425,97 @@
               <w:pStyle w:val="Normal"/>
             </w:pPr>
             <w:r>
-              <w:t>BMI pregravidico medio (18,5-24,9), n (%)</w:t>
-            </w:r>
-          </w:p>
-        </w:tc>
-        <w:tc>
-          <w:p>
-            <w:pPr>
-              <w:pStyle w:val="Normal"/>
-            </w:pPr>
-            <w:r>
-              <w:t>190 (32,3%)</w:t>
-            </w:r>
-          </w:p>
-        </w:tc>
-        <w:tc>
-          <w:p>
-            <w:pPr>
-              <w:pStyle w:val="Normal"/>
-            </w:pPr>
-            <w:r>
-              <w:t>185 (34,0%)</w:t>
-            </w:r>
-          </w:p>
-        </w:tc>
-        <w:tc>
-          <w:p>
-            <w:pPr>
-              <w:pStyle w:val="Normal"/>
-            </w:pPr>
-            <w:r>
-              <w:t>194 (34,7%)</w:t>
-            </w:r>
-          </w:p>
-        </w:tc>
-        <w:tc>
-          <w:p>
-            <w:pPr>
-              <w:pStyle w:val="Normal"/>
-            </w:pPr>
-            <w:r>
-              <w:t>181 (34,3%)</w:t>
-            </w:r>
-          </w:p>
-        </w:tc>
-        <w:tc>
-          <w:p>
-            <w:pPr>
-              <w:pStyle w:val="Normal"/>
-            </w:pPr>
-            <w:r>
-              <w:t>198 (35,6%)</w:t>
-            </w:r>
-          </w:p>
-        </w:tc>
-        <w:tc>
-          <w:p>
-            <w:pPr>
-              <w:pStyle w:val="Normal"/>
-            </w:pPr>
-            <w:r>
-              <w:t>197 (35,5%)</w:t>
-            </w:r>
-          </w:p>
-        </w:tc>
-        <w:tc>
-          <w:p>
-            <w:pPr>
-              <w:pStyle w:val="Normal"/>
-            </w:pPr>
-            <w:r>
-              <w:t>190 (32,8%)</w:t>
-            </w:r>
-          </w:p>
-        </w:tc>
-        <w:tc>
-          <w:p>
-            <w:pPr>
-              <w:pStyle w:val="Normal"/>
-            </w:pPr>
-            <w:r>
-              <w:t>204 (34,6%)</w:t>
-            </w:r>
-          </w:p>
-        </w:tc>
-        <w:tc>
-          <w:p>
-            <w:pPr>
-              <w:pStyle w:val="Normal"/>
-            </w:pPr>
-            <w:r>
-              <w:t>159 (31,8%)</w:t>
+              <w:t>  mediana (Q1 - Q3)</w:t>
+            </w:r>
+          </w:p>
+        </w:tc>
+        <w:tc>
+          <w:p>
+            <w:pPr>
+              <w:pStyle w:val="Normal"/>
+            </w:pPr>
+            <w:r>
+              <w:t>50 (40 - 61)</w:t>
+            </w:r>
+          </w:p>
+        </w:tc>
+        <w:tc>
+          <w:p>
+            <w:pPr>
+              <w:pStyle w:val="Normal"/>
+            </w:pPr>
+            <w:r>
+              <w:t>51 (41 - 60)</w:t>
+            </w:r>
+          </w:p>
+        </w:tc>
+        <w:tc>
+          <w:p>
+            <w:pPr>
+              <w:pStyle w:val="Normal"/>
+            </w:pPr>
+            <w:r>
+              <w:t>51 (41 - 62)</w:t>
+            </w:r>
+          </w:p>
+        </w:tc>
+        <w:tc>
+          <w:p>
+            <w:pPr>
+              <w:pStyle w:val="Normal"/>
+            </w:pPr>
+            <w:r>
+              <w:t>50 (42 - 60)</w:t>
+            </w:r>
+          </w:p>
+        </w:tc>
+        <w:tc>
+          <w:p>
+            <w:pPr>
+              <w:pStyle w:val="Normal"/>
+            </w:pPr>
+            <w:r>
+              <w:t>49 (40 - 59)</w:t>
+            </w:r>
+          </w:p>
+        </w:tc>
+        <w:tc>
+          <w:p>
+            <w:pPr>
+              <w:pStyle w:val="Normal"/>
+            </w:pPr>
+            <w:r>
+              <w:t>50 (42 - 59)</w:t>
+            </w:r>
+          </w:p>
+        </w:tc>
+        <w:tc>
+          <w:p>
+            <w:pPr>
+              <w:pStyle w:val="Normal"/>
+            </w:pPr>
+            <w:r>
+              <w:t>49 (40 - 61)</w:t>
+            </w:r>
+          </w:p>
+        </w:tc>
+        <w:tc>
+          <w:p>
+            <w:pPr>
+              <w:pStyle w:val="Normal"/>
+            </w:pPr>
+            <w:r>
+              <w:t>52 (42 - 61)</w:t>
+            </w:r>
+          </w:p>
+        </w:tc>
+        <w:tc>
+          <w:p>
+            <w:pPr>
+              <w:pStyle w:val="Normal"/>
+            </w:pPr>
+            <w:r>
+              <w:t>51 (40 - 60)</w:t>
             </w:r>
           </w:p>
         </w:tc>
@@ -527,97 +527,97 @@
               <w:pStyle w:val="Normal"/>
             </w:pPr>
             <w:r>
-              <w:t>BMI pregravidico alto (&gt;24,9), n (%)</w:t>
-            </w:r>
-          </w:p>
-        </w:tc>
-        <w:tc>
-          <w:p>
-            <w:pPr>
-              <w:pStyle w:val="Normal"/>
-            </w:pPr>
-            <w:r>
-              <w:t>224 (38,0%)</w:t>
-            </w:r>
-          </w:p>
-        </w:tc>
-        <w:tc>
-          <w:p>
-            <w:pPr>
-              <w:pStyle w:val="Normal"/>
-            </w:pPr>
-            <w:r>
-              <w:t>214 (39,3%)</w:t>
-            </w:r>
-          </w:p>
-        </w:tc>
-        <w:tc>
-          <w:p>
-            <w:pPr>
-              <w:pStyle w:val="Normal"/>
-            </w:pPr>
-            <w:r>
-              <w:t>214 (38,3%)</w:t>
-            </w:r>
-          </w:p>
-        </w:tc>
-        <w:tc>
-          <w:p>
-            <w:pPr>
-              <w:pStyle w:val="Normal"/>
-            </w:pPr>
-            <w:r>
-              <w:t>207 (39,2%)</w:t>
-            </w:r>
-          </w:p>
-        </w:tc>
-        <w:tc>
-          <w:p>
-            <w:pPr>
-              <w:pStyle w:val="Normal"/>
-            </w:pPr>
-            <w:r>
-              <w:t>214 (38,5%)</w:t>
-            </w:r>
-          </w:p>
-        </w:tc>
-        <w:tc>
-          <w:p>
-            <w:pPr>
-              <w:pStyle w:val="Normal"/>
-            </w:pPr>
-            <w:r>
-              <w:t>217 (39,1%)</w:t>
-            </w:r>
-          </w:p>
-        </w:tc>
-        <w:tc>
-          <w:p>
-            <w:pPr>
-              <w:pStyle w:val="Normal"/>
-            </w:pPr>
-            <w:r>
-              <w:t>229 (39,6%)</w:t>
-            </w:r>
-          </w:p>
-        </w:tc>
-        <w:tc>
-          <w:p>
-            <w:pPr>
-              <w:pStyle w:val="Normal"/>
-            </w:pPr>
-            <w:r>
-              <w:t>220 (37,3%)</w:t>
-            </w:r>
-          </w:p>
-        </w:tc>
-        <w:tc>
-          <w:p>
-            <w:pPr>
-              <w:pStyle w:val="Normal"/>
-            </w:pPr>
-            <w:r>
-              <w:t>186 (37,2%)</w:t>
+              <w:t>Classi età alla data indice</w:t>
+            </w:r>
+          </w:p>
+        </w:tc>
+        <w:tc>
+          <w:p>
+            <w:pPr>
+              <w:pStyle w:val="Normal"/>
+            </w:pPr>
+            <w:r>
+              <w:t/>
+            </w:r>
+          </w:p>
+        </w:tc>
+        <w:tc>
+          <w:p>
+            <w:pPr>
+              <w:pStyle w:val="Normal"/>
+            </w:pPr>
+            <w:r>
+              <w:t/>
+            </w:r>
+          </w:p>
+        </w:tc>
+        <w:tc>
+          <w:p>
+            <w:pPr>
+              <w:pStyle w:val="Normal"/>
+            </w:pPr>
+            <w:r>
+              <w:t/>
+            </w:r>
+          </w:p>
+        </w:tc>
+        <w:tc>
+          <w:p>
+            <w:pPr>
+              <w:pStyle w:val="Normal"/>
+            </w:pPr>
+            <w:r>
+              <w:t/>
+            </w:r>
+          </w:p>
+        </w:tc>
+        <w:tc>
+          <w:p>
+            <w:pPr>
+              <w:pStyle w:val="Normal"/>
+            </w:pPr>
+            <w:r>
+              <w:t/>
+            </w:r>
+          </w:p>
+        </w:tc>
+        <w:tc>
+          <w:p>
+            <w:pPr>
+              <w:pStyle w:val="Normal"/>
+            </w:pPr>
+            <w:r>
+              <w:t/>
+            </w:r>
+          </w:p>
+        </w:tc>
+        <w:tc>
+          <w:p>
+            <w:pPr>
+              <w:pStyle w:val="Normal"/>
+            </w:pPr>
+            <w:r>
+              <w:t/>
+            </w:r>
+          </w:p>
+        </w:tc>
+        <w:tc>
+          <w:p>
+            <w:pPr>
+              <w:pStyle w:val="Normal"/>
+            </w:pPr>
+            <w:r>
+              <w:t/>
+            </w:r>
+          </w:p>
+        </w:tc>
+        <w:tc>
+          <w:p>
+            <w:pPr>
+              <w:pStyle w:val="Normal"/>
+            </w:pPr>
+            <w:r>
+              <w:t/>
             </w:r>
           </w:p>
         </w:tc>
@@ -629,97 +629,97 @@
               <w:pStyle w:val="Normal"/>
             </w:pPr>
             <w:r>
-              <w:t>Diabete gestazionale, n (%)</w:t>
-            </w:r>
-          </w:p>
-        </w:tc>
-        <w:tc>
-          <w:p>
-            <w:pPr>
-              <w:pStyle w:val="Normal"/>
-            </w:pPr>
-            <w:r>
-              <w:t>157 (26,7%)</w:t>
-            </w:r>
-          </w:p>
-        </w:tc>
-        <w:tc>
-          <w:p>
-            <w:pPr>
-              <w:pStyle w:val="Normal"/>
-            </w:pPr>
-            <w:r>
-              <w:t>146 (26,8%)</w:t>
-            </w:r>
-          </w:p>
-        </w:tc>
-        <w:tc>
-          <w:p>
-            <w:pPr>
-              <w:pStyle w:val="Normal"/>
-            </w:pPr>
-            <w:r>
-              <w:t>146 (26,1%)</w:t>
-            </w:r>
-          </w:p>
-        </w:tc>
-        <w:tc>
-          <w:p>
-            <w:pPr>
-              <w:pStyle w:val="Normal"/>
-            </w:pPr>
-            <w:r>
-              <w:t>150 (28,4%)</w:t>
-            </w:r>
-          </w:p>
-        </w:tc>
-        <w:tc>
-          <w:p>
-            <w:pPr>
-              <w:pStyle w:val="Normal"/>
-            </w:pPr>
-            <w:r>
-              <w:t>173 (31,1%)</w:t>
-            </w:r>
-          </w:p>
-        </w:tc>
-        <w:tc>
-          <w:p>
-            <w:pPr>
-              <w:pStyle w:val="Normal"/>
-            </w:pPr>
-            <w:r>
-              <w:t>138 (24,9%)</w:t>
-            </w:r>
-          </w:p>
-        </w:tc>
-        <w:tc>
-          <w:p>
-            <w:pPr>
-              <w:pStyle w:val="Normal"/>
-            </w:pPr>
-            <w:r>
-              <w:t>174 (30,1%)</w:t>
-            </w:r>
-          </w:p>
-        </w:tc>
-        <w:tc>
-          <w:p>
-            <w:pPr>
-              <w:pStyle w:val="Normal"/>
-            </w:pPr>
-            <w:r>
-              <w:t>181 (30,7%)</w:t>
-            </w:r>
-          </w:p>
-        </w:tc>
-        <w:tc>
-          <w:p>
-            <w:pPr>
-              <w:pStyle w:val="Normal"/>
-            </w:pPr>
-            <w:r>
-              <w:t>133 (26,6%)</w:t>
+              <w:t>  18-44, n (%)</w:t>
+            </w:r>
+          </w:p>
+        </w:tc>
+        <w:tc>
+          <w:p>
+            <w:pPr>
+              <w:pStyle w:val="Normal"/>
+            </w:pPr>
+            <w:r>
+              <w:t>206 (36,9%)</w:t>
+            </w:r>
+          </w:p>
+        </w:tc>
+        <w:tc>
+          <w:p>
+            <w:pPr>
+              <w:pStyle w:val="Normal"/>
+            </w:pPr>
+            <w:r>
+              <w:t>197 (33,8%)</w:t>
+            </w:r>
+          </w:p>
+        </w:tc>
+        <w:tc>
+          <w:p>
+            <w:pPr>
+              <w:pStyle w:val="Normal"/>
+            </w:pPr>
+            <w:r>
+              <w:t>173 (33,1%)</w:t>
+            </w:r>
+          </w:p>
+        </w:tc>
+        <w:tc>
+          <w:p>
+            <w:pPr>
+              <w:pStyle w:val="Normal"/>
+            </w:pPr>
+            <w:r>
+              <w:t>176 (33,1%)</w:t>
+            </w:r>
+          </w:p>
+        </w:tc>
+        <w:tc>
+          <w:p>
+            <w:pPr>
+              <w:pStyle w:val="Normal"/>
+            </w:pPr>
+            <w:r>
+              <w:t>200 (36,4%)</w:t>
+            </w:r>
+          </w:p>
+        </w:tc>
+        <w:tc>
+          <w:p>
+            <w:pPr>
+              <w:pStyle w:val="Normal"/>
+            </w:pPr>
+            <w:r>
+              <w:t>178 (34,3%)</w:t>
+            </w:r>
+          </w:p>
+        </w:tc>
+        <w:tc>
+          <w:p>
+            <w:pPr>
+              <w:pStyle w:val="Normal"/>
+            </w:pPr>
+            <w:r>
+              <w:t>214 (35,3%)</w:t>
+            </w:r>
+          </w:p>
+        </w:tc>
+        <w:tc>
+          <w:p>
+            <w:pPr>
+              <w:pStyle w:val="Normal"/>
+            </w:pPr>
+            <w:r>
+              <w:t>195 (33,2%)</w:t>
+            </w:r>
+          </w:p>
+        </w:tc>
+        <w:tc>
+          <w:p>
+            <w:pPr>
+              <w:pStyle w:val="Normal"/>
+            </w:pPr>
+            <w:r>
+              <w:t>191 (35,1%)</w:t>
             </w:r>
           </w:p>
         </w:tc>
@@ -731,6 +731,516 @@
               <w:pStyle w:val="Normal"/>
             </w:pPr>
             <w:r>
+              <w:t>  45-64, n (%)</w:t>
+            </w:r>
+          </w:p>
+        </w:tc>
+        <w:tc>
+          <w:p>
+            <w:pPr>
+              <w:pStyle w:val="Normal"/>
+            </w:pPr>
+            <w:r>
+              <w:t>262 (46,9%)</w:t>
+            </w:r>
+          </w:p>
+        </w:tc>
+        <w:tc>
+          <w:p>
+            <w:pPr>
+              <w:pStyle w:val="Normal"/>
+            </w:pPr>
+            <w:r>
+              <w:t>290 (49,8%)</w:t>
+            </w:r>
+          </w:p>
+        </w:tc>
+        <w:tc>
+          <w:p>
+            <w:pPr>
+              <w:pStyle w:val="Normal"/>
+            </w:pPr>
+            <w:r>
+              <w:t>248 (47,5%)</w:t>
+            </w:r>
+          </w:p>
+        </w:tc>
+        <w:tc>
+          <w:p>
+            <w:pPr>
+              <w:pStyle w:val="Normal"/>
+            </w:pPr>
+            <w:r>
+              <w:t>260 (49,0%)</w:t>
+            </w:r>
+          </w:p>
+        </w:tc>
+        <w:tc>
+          <w:p>
+            <w:pPr>
+              <w:pStyle w:val="Normal"/>
+            </w:pPr>
+            <w:r>
+              <w:t>273 (49,7%)</w:t>
+            </w:r>
+          </w:p>
+        </w:tc>
+        <w:tc>
+          <w:p>
+            <w:pPr>
+              <w:pStyle w:val="Normal"/>
+            </w:pPr>
+            <w:r>
+              <w:t>262 (50,5%)</w:t>
+            </w:r>
+          </w:p>
+        </w:tc>
+        <w:tc>
+          <w:p>
+            <w:pPr>
+              <w:pStyle w:val="Normal"/>
+            </w:pPr>
+            <w:r>
+              <w:t>279 (46,0%)</w:t>
+            </w:r>
+          </w:p>
+        </w:tc>
+        <w:tc>
+          <w:p>
+            <w:pPr>
+              <w:pStyle w:val="Normal"/>
+            </w:pPr>
+            <w:r>
+              <w:t>286 (48,6%)</w:t>
+            </w:r>
+          </w:p>
+        </w:tc>
+        <w:tc>
+          <w:p>
+            <w:pPr>
+              <w:pStyle w:val="Normal"/>
+            </w:pPr>
+            <w:r>
+              <w:t>263 (48,3%)</w:t>
+            </w:r>
+          </w:p>
+        </w:tc>
+      </w:tr>
+      <w:tr>
+        <w:tc>
+          <w:p>
+            <w:pPr>
+              <w:pStyle w:val="Normal"/>
+            </w:pPr>
+            <w:r>
+              <w:t>BMI pregravidico basso (&lt;18,5), n (%)</w:t>
+            </w:r>
+          </w:p>
+        </w:tc>
+        <w:tc>
+          <w:p>
+            <w:pPr>
+              <w:pStyle w:val="Normal"/>
+            </w:pPr>
+            <w:r>
+              <w:t>92 (16,5%)</w:t>
+            </w:r>
+          </w:p>
+        </w:tc>
+        <w:tc>
+          <w:p>
+            <w:pPr>
+              <w:pStyle w:val="Normal"/>
+            </w:pPr>
+            <w:r>
+              <w:t>100 (17,2%)</w:t>
+            </w:r>
+          </w:p>
+        </w:tc>
+        <w:tc>
+          <w:p>
+            <w:pPr>
+              <w:pStyle w:val="Normal"/>
+            </w:pPr>
+            <w:r>
+              <w:t>97 (18,6%)</w:t>
+            </w:r>
+          </w:p>
+        </w:tc>
+        <w:tc>
+          <w:p>
+            <w:pPr>
+              <w:pStyle w:val="Normal"/>
+            </w:pPr>
+            <w:r>
+              <w:t>90 (16,9%)</w:t>
+            </w:r>
+          </w:p>
+        </w:tc>
+        <w:tc>
+          <w:p>
+            <w:pPr>
+              <w:pStyle w:val="Normal"/>
+            </w:pPr>
+            <w:r>
+              <w:t>78 (14,2%)</w:t>
+            </w:r>
+          </w:p>
+        </w:tc>
+        <w:tc>
+          <w:p>
+            <w:pPr>
+              <w:pStyle w:val="Normal"/>
+            </w:pPr>
+            <w:r>
+              <w:t>88 (17,0%)</w:t>
+            </w:r>
+          </w:p>
+        </w:tc>
+        <w:tc>
+          <w:p>
+            <w:pPr>
+              <w:pStyle w:val="Normal"/>
+            </w:pPr>
+            <w:r>
+              <w:t>106 (17,5%)</w:t>
+            </w:r>
+          </w:p>
+        </w:tc>
+        <w:tc>
+          <w:p>
+            <w:pPr>
+              <w:pStyle w:val="Normal"/>
+            </w:pPr>
+            <w:r>
+              <w:t>118 (20,1%)</w:t>
+            </w:r>
+          </w:p>
+        </w:tc>
+        <w:tc>
+          <w:p>
+            <w:pPr>
+              <w:pStyle w:val="Normal"/>
+            </w:pPr>
+            <w:r>
+              <w:t>83 (15,3%)</w:t>
+            </w:r>
+          </w:p>
+        </w:tc>
+      </w:tr>
+      <w:tr>
+        <w:tc>
+          <w:p>
+            <w:pPr>
+              <w:pStyle w:val="Normal"/>
+            </w:pPr>
+            <w:r>
+              <w:t>BMI pregravidico medio (18,5-24,9), n (%)</w:t>
+            </w:r>
+          </w:p>
+        </w:tc>
+        <w:tc>
+          <w:p>
+            <w:pPr>
+              <w:pStyle w:val="Normal"/>
+            </w:pPr>
+            <w:r>
+              <w:t>59 (10,6%)</w:t>
+            </w:r>
+          </w:p>
+        </w:tc>
+        <w:tc>
+          <w:p>
+            <w:pPr>
+              <w:pStyle w:val="Normal"/>
+            </w:pPr>
+            <w:r>
+              <w:t>71 (12,2%)</w:t>
+            </w:r>
+          </w:p>
+        </w:tc>
+        <w:tc>
+          <w:p>
+            <w:pPr>
+              <w:pStyle w:val="Normal"/>
+            </w:pPr>
+            <w:r>
+              <w:t>56 (10,7%)</w:t>
+            </w:r>
+          </w:p>
+        </w:tc>
+        <w:tc>
+          <w:p>
+            <w:pPr>
+              <w:pStyle w:val="Normal"/>
+            </w:pPr>
+            <w:r>
+              <w:t>53 (10,0%)</w:t>
+            </w:r>
+          </w:p>
+        </w:tc>
+        <w:tc>
+          <w:p>
+            <w:pPr>
+              <w:pStyle w:val="Normal"/>
+            </w:pPr>
+            <w:r>
+              <w:t>61 (11,1%)</w:t>
+            </w:r>
+          </w:p>
+        </w:tc>
+        <w:tc>
+          <w:p>
+            <w:pPr>
+              <w:pStyle w:val="Normal"/>
+            </w:pPr>
+            <w:r>
+              <w:t>63 (12,1%)</w:t>
+            </w:r>
+          </w:p>
+        </w:tc>
+        <w:tc>
+          <w:p>
+            <w:pPr>
+              <w:pStyle w:val="Normal"/>
+            </w:pPr>
+            <w:r>
+              <w:t>62 (10,2%)</w:t>
+            </w:r>
+          </w:p>
+        </w:tc>
+        <w:tc>
+          <w:p>
+            <w:pPr>
+              <w:pStyle w:val="Normal"/>
+            </w:pPr>
+            <w:r>
+              <w:t>57 (9,7%)</w:t>
+            </w:r>
+          </w:p>
+        </w:tc>
+        <w:tc>
+          <w:p>
+            <w:pPr>
+              <w:pStyle w:val="Normal"/>
+            </w:pPr>
+            <w:r>
+              <w:t>55 (10,1%)</w:t>
+            </w:r>
+          </w:p>
+        </w:tc>
+      </w:tr>
+      <w:tr>
+        <w:tc>
+          <w:p>
+            <w:pPr>
+              <w:pStyle w:val="Normal"/>
+            </w:pPr>
+            <w:r>
+              <w:t>BMI pregravidico alto (&gt;24,9), n (%)</w:t>
+            </w:r>
+          </w:p>
+        </w:tc>
+        <w:tc>
+          <w:p>
+            <w:pPr>
+              <w:pStyle w:val="Normal"/>
+            </w:pPr>
+            <w:r>
+              <w:t>408 (73,0%)</w:t>
+            </w:r>
+          </w:p>
+        </w:tc>
+        <w:tc>
+          <w:p>
+            <w:pPr>
+              <w:pStyle w:val="Normal"/>
+            </w:pPr>
+            <w:r>
+              <w:t>411 (70,6%)</w:t>
+            </w:r>
+          </w:p>
+        </w:tc>
+        <w:tc>
+          <w:p>
+            <w:pPr>
+              <w:pStyle w:val="Normal"/>
+            </w:pPr>
+            <w:r>
+              <w:t>369 (70,7%)</w:t>
+            </w:r>
+          </w:p>
+        </w:tc>
+        <w:tc>
+          <w:p>
+            <w:pPr>
+              <w:pStyle w:val="Normal"/>
+            </w:pPr>
+            <w:r>
+              <w:t>388 (73,1%)</w:t>
+            </w:r>
+          </w:p>
+        </w:tc>
+        <w:tc>
+          <w:p>
+            <w:pPr>
+              <w:pStyle w:val="Normal"/>
+            </w:pPr>
+            <w:r>
+              <w:t>410 (74,7%)</w:t>
+            </w:r>
+          </w:p>
+        </w:tc>
+        <w:tc>
+          <w:p>
+            <w:pPr>
+              <w:pStyle w:val="Normal"/>
+            </w:pPr>
+            <w:r>
+              <w:t>368 (70,9%)</w:t>
+            </w:r>
+          </w:p>
+        </w:tc>
+        <w:tc>
+          <w:p>
+            <w:pPr>
+              <w:pStyle w:val="Normal"/>
+            </w:pPr>
+            <w:r>
+              <w:t>438 (72,3%)</w:t>
+            </w:r>
+          </w:p>
+        </w:tc>
+        <w:tc>
+          <w:p>
+            <w:pPr>
+              <w:pStyle w:val="Normal"/>
+            </w:pPr>
+            <w:r>
+              <w:t>413 (70,2%)</w:t>
+            </w:r>
+          </w:p>
+        </w:tc>
+        <w:tc>
+          <w:p>
+            <w:pPr>
+              <w:pStyle w:val="Normal"/>
+            </w:pPr>
+            <w:r>
+              <w:t>406 (74,6%)</w:t>
+            </w:r>
+          </w:p>
+        </w:tc>
+      </w:tr>
+      <w:tr>
+        <w:tc>
+          <w:p>
+            <w:pPr>
+              <w:pStyle w:val="Normal"/>
+            </w:pPr>
+            <w:r>
+              <w:t>Diabete gestazionale, n (%)</w:t>
+            </w:r>
+          </w:p>
+        </w:tc>
+        <w:tc>
+          <w:p>
+            <w:pPr>
+              <w:pStyle w:val="Normal"/>
+            </w:pPr>
+            <w:r>
+              <w:t>342 (61,2%)</w:t>
+            </w:r>
+          </w:p>
+        </w:tc>
+        <w:tc>
+          <w:p>
+            <w:pPr>
+              <w:pStyle w:val="Normal"/>
+            </w:pPr>
+            <w:r>
+              <w:t>356 (61,2%)</w:t>
+            </w:r>
+          </w:p>
+        </w:tc>
+        <w:tc>
+          <w:p>
+            <w:pPr>
+              <w:pStyle w:val="Normal"/>
+            </w:pPr>
+            <w:r>
+              <w:t>325 (62,3%)</w:t>
+            </w:r>
+          </w:p>
+        </w:tc>
+        <w:tc>
+          <w:p>
+            <w:pPr>
+              <w:pStyle w:val="Normal"/>
+            </w:pPr>
+            <w:r>
+              <w:t>336 (63,3%)</w:t>
+            </w:r>
+          </w:p>
+        </w:tc>
+        <w:tc>
+          <w:p>
+            <w:pPr>
+              <w:pStyle w:val="Normal"/>
+            </w:pPr>
+            <w:r>
+              <w:t>331 (60,3%)</w:t>
+            </w:r>
+          </w:p>
+        </w:tc>
+        <w:tc>
+          <w:p>
+            <w:pPr>
+              <w:pStyle w:val="Normal"/>
+            </w:pPr>
+            <w:r>
+              <w:t>316 (60,9%)</w:t>
+            </w:r>
+          </w:p>
+        </w:tc>
+        <w:tc>
+          <w:p>
+            <w:pPr>
+              <w:pStyle w:val="Normal"/>
+            </w:pPr>
+            <w:r>
+              <w:t>389 (64,2%)</w:t>
+            </w:r>
+          </w:p>
+        </w:tc>
+        <w:tc>
+          <w:p>
+            <w:pPr>
+              <w:pStyle w:val="Normal"/>
+            </w:pPr>
+            <w:r>
+              <w:t>369 (62,8%)</w:t>
+            </w:r>
+          </w:p>
+        </w:tc>
+        <w:tc>
+          <w:p>
+            <w:pPr>
+              <w:pStyle w:val="Normal"/>
+            </w:pPr>
+            <w:r>
+              <w:t>333 (61,2%)</w:t>
+            </w:r>
+          </w:p>
+        </w:tc>
+      </w:tr>
+      <w:tr>
+        <w:tc>
+          <w:p>
+            <w:pPr>
+              <w:pStyle w:val="Normal"/>
+            </w:pPr>
+            <w:r>
               <w:t>Diabete pregravidico, n (%)</w:t>
             </w:r>
           </w:p>
@@ -741,87 +1251,87 @@
               <w:pStyle w:val="Normal"/>
             </w:pPr>
             <w:r>
-              <w:t>443 (75,2%)</w:t>
-            </w:r>
-          </w:p>
-        </w:tc>
-        <w:tc>
-          <w:p>
-            <w:pPr>
-              <w:pStyle w:val="Normal"/>
-            </w:pPr>
-            <w:r>
-              <w:t>380 (69,9%)</w:t>
-            </w:r>
-          </w:p>
-        </w:tc>
-        <w:tc>
-          <w:p>
-            <w:pPr>
-              <w:pStyle w:val="Normal"/>
-            </w:pPr>
-            <w:r>
-              <w:t>402 (71,9%)</w:t>
-            </w:r>
-          </w:p>
-        </w:tc>
-        <w:tc>
-          <w:p>
-            <w:pPr>
-              <w:pStyle w:val="Normal"/>
-            </w:pPr>
-            <w:r>
-              <w:t>394 (74,6%)</w:t>
-            </w:r>
-          </w:p>
-        </w:tc>
-        <w:tc>
-          <w:p>
-            <w:pPr>
-              <w:pStyle w:val="Normal"/>
-            </w:pPr>
-            <w:r>
-              <w:t>410 (73,7%)</w:t>
-            </w:r>
-          </w:p>
-        </w:tc>
-        <w:tc>
-          <w:p>
-            <w:pPr>
-              <w:pStyle w:val="Normal"/>
-            </w:pPr>
-            <w:r>
-              <w:t>413 (74,4%)</w:t>
-            </w:r>
-          </w:p>
-        </w:tc>
-        <w:tc>
-          <w:p>
-            <w:pPr>
-              <w:pStyle w:val="Normal"/>
-            </w:pPr>
-            <w:r>
-              <w:t>410 (70,8%)</w:t>
-            </w:r>
-          </w:p>
-        </w:tc>
-        <w:tc>
-          <w:p>
-            <w:pPr>
-              <w:pStyle w:val="Normal"/>
-            </w:pPr>
-            <w:r>
-              <w:t>430 (72,9%)</w:t>
-            </w:r>
-          </w:p>
-        </w:tc>
-        <w:tc>
-          <w:p>
-            <w:pPr>
-              <w:pStyle w:val="Normal"/>
-            </w:pPr>
-            <w:r>
-              <w:t>378 (75,6%)</w:t>
+              <w:t>328 (58,7%)</w:t>
+            </w:r>
+          </w:p>
+        </w:tc>
+        <w:tc>
+          <w:p>
+            <w:pPr>
+              <w:pStyle w:val="Normal"/>
+            </w:pPr>
+            <w:r>
+              <w:t>344 (59,1%)</w:t>
+            </w:r>
+          </w:p>
+        </w:tc>
+        <w:tc>
+          <w:p>
+            <w:pPr>
+              <w:pStyle w:val="Normal"/>
+            </w:pPr>
+            <w:r>
+              <w:t>289 (55,4%)</w:t>
+            </w:r>
+          </w:p>
+        </w:tc>
+        <w:tc>
+          <w:p>
+            <w:pPr>
+              <w:pStyle w:val="Normal"/>
+            </w:pPr>
+            <w:r>
+              <w:t>317 (59,7%)</w:t>
+            </w:r>
+          </w:p>
+        </w:tc>
+        <w:tc>
+          <w:p>
+            <w:pPr>
+              <w:pStyle w:val="Normal"/>
+            </w:pPr>
+            <w:r>
+              <w:t>319 (58,1%)</w:t>
+            </w:r>
+          </w:p>
+        </w:tc>
+        <w:tc>
+          <w:p>
+            <w:pPr>
+              <w:pStyle w:val="Normal"/>
+            </w:pPr>
+            <w:r>
+              <w:t>298 (57,4%)</w:t>
+            </w:r>
+          </w:p>
+        </w:tc>
+        <w:tc>
+          <w:p>
+            <w:pPr>
+              <w:pStyle w:val="Normal"/>
+            </w:pPr>
+            <w:r>
+              <w:t>327 (54,0%)</w:t>
+            </w:r>
+          </w:p>
+        </w:tc>
+        <w:tc>
+          <w:p>
+            <w:pPr>
+              <w:pStyle w:val="Normal"/>
+            </w:pPr>
+            <w:r>
+              <w:t>332 (56,5%)</w:t>
+            </w:r>
+          </w:p>
+        </w:tc>
+        <w:tc>
+          <w:p>
+            <w:pPr>
+              <w:pStyle w:val="Normal"/>
+            </w:pPr>
+            <w:r>
+              <w:t>309 (56,8%)</w:t>
             </w:r>
           </w:p>
         </w:tc>

</xml_diff>